<commit_message>
Redesain seluruh diagram BAB III (Task 24): 6 -> 8 figur, huruf cetak 3,2-6,4pt -> 9,2-11,8pt, integritas sumber terverifikasi; DOCX 68 hlm + laporan audit
</commit_message>
<xml_diff>
--- a/download/translator-sibi-docx/Proposal-Penerjemah-Dua-Arah-SIBI-CSI-ESP32S3.docx
+++ b/download/translator-sibi-docx/Proposal-Penerjemah-Dua-Arah-SIBI-CSI-ESP32S3.docx
@@ -572,7 +572,7 @@
         </w:p>
         <w:p>
           <w:pPr>
-            <w:pStyle w:val="9"/>
+            <w:pStyle w:val="TOC1"/>
             <w:tabs>
               <w:tab w:val="right" w:leader="dot" w:pos="9026"/>
             </w:tabs>
@@ -590,7 +590,7 @@
         </w:p>
         <w:p>
           <w:pPr>
-            <w:pStyle w:val="11"/>
+            <w:pStyle w:val="TOC2"/>
             <w:ind w:left="360"/>
             <w:tabs>
               <w:tab w:val="right" w:leader="dot" w:pos="9026"/>
@@ -609,7 +609,7 @@
         </w:p>
         <w:p>
           <w:pPr>
-            <w:pStyle w:val="11"/>
+            <w:pStyle w:val="TOC2"/>
             <w:ind w:left="360"/>
             <w:tabs>
               <w:tab w:val="right" w:leader="dot" w:pos="9026"/>
@@ -628,7 +628,7 @@
         </w:p>
         <w:p>
           <w:pPr>
-            <w:pStyle w:val="11"/>
+            <w:pStyle w:val="TOC2"/>
             <w:ind w:left="360"/>
             <w:tabs>
               <w:tab w:val="right" w:leader="dot" w:pos="9026"/>
@@ -647,7 +647,7 @@
         </w:p>
         <w:p>
           <w:pPr>
-            <w:pStyle w:val="11"/>
+            <w:pStyle w:val="TOC2"/>
             <w:ind w:left="360"/>
             <w:tabs>
               <w:tab w:val="right" w:leader="dot" w:pos="9026"/>
@@ -666,7 +666,7 @@
         </w:p>
         <w:p>
           <w:pPr>
-            <w:pStyle w:val="11"/>
+            <w:pStyle w:val="TOC2"/>
             <w:ind w:left="360"/>
             <w:tabs>
               <w:tab w:val="right" w:leader="dot" w:pos="9026"/>
@@ -685,7 +685,7 @@
         </w:p>
         <w:p>
           <w:pPr>
-            <w:pStyle w:val="12"/>
+            <w:pStyle w:val="TOC3"/>
             <w:ind w:left="720"/>
             <w:tabs>
               <w:tab w:val="right" w:leader="dot" w:pos="9026"/>
@@ -704,7 +704,7 @@
         </w:p>
         <w:p>
           <w:pPr>
-            <w:pStyle w:val="12"/>
+            <w:pStyle w:val="TOC3"/>
             <w:ind w:left="720"/>
             <w:tabs>
               <w:tab w:val="right" w:leader="dot" w:pos="9026"/>
@@ -723,7 +723,7 @@
         </w:p>
         <w:p>
           <w:pPr>
-            <w:pStyle w:val="11"/>
+            <w:pStyle w:val="TOC2"/>
             <w:ind w:left="360"/>
             <w:tabs>
               <w:tab w:val="right" w:leader="dot" w:pos="9026"/>
@@ -742,7 +742,7 @@
         </w:p>
         <w:p>
           <w:pPr>
-            <w:pStyle w:val="9"/>
+            <w:pStyle w:val="TOC1"/>
             <w:tabs>
               <w:tab w:val="right" w:leader="dot" w:pos="9026"/>
             </w:tabs>
@@ -760,7 +760,7 @@
         </w:p>
         <w:p>
           <w:pPr>
-            <w:pStyle w:val="11"/>
+            <w:pStyle w:val="TOC2"/>
             <w:ind w:left="360"/>
             <w:tabs>
               <w:tab w:val="right" w:leader="dot" w:pos="9026"/>
@@ -779,7 +779,7 @@
         </w:p>
         <w:p>
           <w:pPr>
-            <w:pStyle w:val="11"/>
+            <w:pStyle w:val="TOC2"/>
             <w:ind w:left="360"/>
             <w:tabs>
               <w:tab w:val="right" w:leader="dot" w:pos="9026"/>
@@ -798,7 +798,7 @@
         </w:p>
         <w:p>
           <w:pPr>
-            <w:pStyle w:val="11"/>
+            <w:pStyle w:val="TOC2"/>
             <w:ind w:left="360"/>
             <w:tabs>
               <w:tab w:val="right" w:leader="dot" w:pos="9026"/>
@@ -817,7 +817,7 @@
         </w:p>
         <w:p>
           <w:pPr>
-            <w:pStyle w:val="11"/>
+            <w:pStyle w:val="TOC2"/>
             <w:ind w:left="360"/>
             <w:tabs>
               <w:tab w:val="right" w:leader="dot" w:pos="9026"/>
@@ -836,7 +836,7 @@
         </w:p>
         <w:p>
           <w:pPr>
-            <w:pStyle w:val="11"/>
+            <w:pStyle w:val="TOC2"/>
             <w:ind w:left="360"/>
             <w:tabs>
               <w:tab w:val="right" w:leader="dot" w:pos="9026"/>
@@ -855,7 +855,7 @@
         </w:p>
         <w:p>
           <w:pPr>
-            <w:pStyle w:val="11"/>
+            <w:pStyle w:val="TOC2"/>
             <w:ind w:left="360"/>
             <w:tabs>
               <w:tab w:val="right" w:leader="dot" w:pos="9026"/>
@@ -874,7 +874,7 @@
         </w:p>
         <w:p>
           <w:pPr>
-            <w:pStyle w:val="11"/>
+            <w:pStyle w:val="TOC2"/>
             <w:ind w:left="360"/>
             <w:tabs>
               <w:tab w:val="right" w:leader="dot" w:pos="9026"/>
@@ -893,7 +893,7 @@
         </w:p>
         <w:p>
           <w:pPr>
-            <w:pStyle w:val="11"/>
+            <w:pStyle w:val="TOC2"/>
             <w:ind w:left="360"/>
             <w:tabs>
               <w:tab w:val="right" w:leader="dot" w:pos="9026"/>
@@ -912,7 +912,7 @@
         </w:p>
         <w:p>
           <w:pPr>
-            <w:pStyle w:val="11"/>
+            <w:pStyle w:val="TOC2"/>
             <w:ind w:left="360"/>
             <w:tabs>
               <w:tab w:val="right" w:leader="dot" w:pos="9026"/>
@@ -931,7 +931,7 @@
         </w:p>
         <w:p>
           <w:pPr>
-            <w:pStyle w:val="11"/>
+            <w:pStyle w:val="TOC2"/>
             <w:ind w:left="360"/>
             <w:tabs>
               <w:tab w:val="right" w:leader="dot" w:pos="9026"/>
@@ -950,7 +950,7 @@
         </w:p>
         <w:p>
           <w:pPr>
-            <w:pStyle w:val="11"/>
+            <w:pStyle w:val="TOC2"/>
             <w:ind w:left="360"/>
             <w:tabs>
               <w:tab w:val="right" w:leader="dot" w:pos="9026"/>
@@ -969,7 +969,7 @@
         </w:p>
         <w:p>
           <w:pPr>
-            <w:pStyle w:val="9"/>
+            <w:pStyle w:val="TOC1"/>
             <w:tabs>
               <w:tab w:val="right" w:leader="dot" w:pos="9026"/>
             </w:tabs>
@@ -987,7 +987,7 @@
         </w:p>
         <w:p>
           <w:pPr>
-            <w:pStyle w:val="11"/>
+            <w:pStyle w:val="TOC2"/>
             <w:ind w:left="360"/>
             <w:tabs>
               <w:tab w:val="right" w:leader="dot" w:pos="9026"/>
@@ -1006,7 +1006,7 @@
         </w:p>
         <w:p>
           <w:pPr>
-            <w:pStyle w:val="11"/>
+            <w:pStyle w:val="TOC2"/>
             <w:ind w:left="360"/>
             <w:tabs>
               <w:tab w:val="right" w:leader="dot" w:pos="9026"/>
@@ -1025,7 +1025,7 @@
         </w:p>
         <w:p>
           <w:pPr>
-            <w:pStyle w:val="12"/>
+            <w:pStyle w:val="TOC3"/>
             <w:ind w:left="720"/>
             <w:tabs>
               <w:tab w:val="right" w:leader="dot" w:pos="9026"/>
@@ -1044,7 +1044,7 @@
         </w:p>
         <w:p>
           <w:pPr>
-            <w:pStyle w:val="12"/>
+            <w:pStyle w:val="TOC3"/>
             <w:ind w:left="720"/>
             <w:tabs>
               <w:tab w:val="right" w:leader="dot" w:pos="9026"/>
@@ -1063,7 +1063,7 @@
         </w:p>
         <w:p>
           <w:pPr>
-            <w:pStyle w:val="12"/>
+            <w:pStyle w:val="TOC3"/>
             <w:ind w:left="720"/>
             <w:tabs>
               <w:tab w:val="right" w:leader="dot" w:pos="9026"/>
@@ -1082,7 +1082,7 @@
         </w:p>
         <w:p>
           <w:pPr>
-            <w:pStyle w:val="12"/>
+            <w:pStyle w:val="TOC3"/>
             <w:ind w:left="720"/>
             <w:tabs>
               <w:tab w:val="right" w:leader="dot" w:pos="9026"/>
@@ -1101,7 +1101,7 @@
         </w:p>
         <w:p>
           <w:pPr>
-            <w:pStyle w:val="12"/>
+            <w:pStyle w:val="TOC3"/>
             <w:ind w:left="720"/>
             <w:tabs>
               <w:tab w:val="right" w:leader="dot" w:pos="9026"/>
@@ -1120,7 +1120,7 @@
         </w:p>
         <w:p>
           <w:pPr>
-            <w:pStyle w:val="12"/>
+            <w:pStyle w:val="TOC3"/>
             <w:ind w:left="720"/>
             <w:tabs>
               <w:tab w:val="right" w:leader="dot" w:pos="9026"/>
@@ -1134,12 +1134,12 @@
             <w:tab/>
           </w:r>
           <w:r>
-            <w:t>16</w:t>
+            <w:t>17</w:t>
           </w:r>
         </w:p>
         <w:p>
           <w:pPr>
-            <w:pStyle w:val="11"/>
+            <w:pStyle w:val="TOC2"/>
             <w:ind w:left="360"/>
             <w:tabs>
               <w:tab w:val="right" w:leader="dot" w:pos="9026"/>
@@ -1153,12 +1153,12 @@
             <w:tab/>
           </w:r>
           <w:r>
-            <w:t>16</w:t>
+            <w:t>17</w:t>
           </w:r>
         </w:p>
         <w:p>
           <w:pPr>
-            <w:pStyle w:val="11"/>
+            <w:pStyle w:val="TOC2"/>
             <w:ind w:left="360"/>
             <w:tabs>
               <w:tab w:val="right" w:leader="dot" w:pos="9026"/>
@@ -1177,7 +1177,7 @@
         </w:p>
         <w:p>
           <w:pPr>
-            <w:pStyle w:val="11"/>
+            <w:pStyle w:val="TOC2"/>
             <w:ind w:left="360"/>
             <w:tabs>
               <w:tab w:val="right" w:leader="dot" w:pos="9026"/>
@@ -1196,7 +1196,7 @@
         </w:p>
         <w:p>
           <w:pPr>
-            <w:pStyle w:val="12"/>
+            <w:pStyle w:val="TOC3"/>
             <w:ind w:left="720"/>
             <w:tabs>
               <w:tab w:val="right" w:leader="dot" w:pos="9026"/>
@@ -1215,7 +1215,7 @@
         </w:p>
         <w:p>
           <w:pPr>
-            <w:pStyle w:val="12"/>
+            <w:pStyle w:val="TOC3"/>
             <w:ind w:left="720"/>
             <w:tabs>
               <w:tab w:val="right" w:leader="dot" w:pos="9026"/>
@@ -1229,12 +1229,12 @@
             <w:tab/>
           </w:r>
           <w:r>
-            <w:t>18</w:t>
+            <w:t>19</w:t>
           </w:r>
         </w:p>
         <w:p>
           <w:pPr>
-            <w:pStyle w:val="12"/>
+            <w:pStyle w:val="TOC3"/>
             <w:ind w:left="720"/>
             <w:tabs>
               <w:tab w:val="right" w:leader="dot" w:pos="9026"/>
@@ -1253,7 +1253,7 @@
         </w:p>
         <w:p>
           <w:pPr>
-            <w:pStyle w:val="12"/>
+            <w:pStyle w:val="TOC3"/>
             <w:ind w:left="720"/>
             <w:tabs>
               <w:tab w:val="right" w:leader="dot" w:pos="9026"/>
@@ -1272,7 +1272,7 @@
         </w:p>
         <w:p>
           <w:pPr>
-            <w:pStyle w:val="11"/>
+            <w:pStyle w:val="TOC2"/>
             <w:ind w:left="360"/>
             <w:tabs>
               <w:tab w:val="right" w:leader="dot" w:pos="9026"/>
@@ -1286,12 +1286,12 @@
             <w:tab/>
           </w:r>
           <w:r>
-            <w:t>19</w:t>
+            <w:t>20</w:t>
           </w:r>
         </w:p>
         <w:p>
           <w:pPr>
-            <w:pStyle w:val="12"/>
+            <w:pStyle w:val="TOC3"/>
             <w:ind w:left="720"/>
             <w:tabs>
               <w:tab w:val="right" w:leader="dot" w:pos="9026"/>
@@ -1305,12 +1305,12 @@
             <w:tab/>
           </w:r>
           <w:r>
-            <w:t>19</w:t>
+            <w:t>20</w:t>
           </w:r>
         </w:p>
         <w:p>
           <w:pPr>
-            <w:pStyle w:val="12"/>
+            <w:pStyle w:val="TOC3"/>
             <w:ind w:left="720"/>
             <w:tabs>
               <w:tab w:val="right" w:leader="dot" w:pos="9026"/>
@@ -1329,7 +1329,7 @@
         </w:p>
         <w:p>
           <w:pPr>
-            <w:pStyle w:val="12"/>
+            <w:pStyle w:val="TOC3"/>
             <w:ind w:left="720"/>
             <w:tabs>
               <w:tab w:val="right" w:leader="dot" w:pos="9026"/>
@@ -1348,7 +1348,7 @@
         </w:p>
         <w:p>
           <w:pPr>
-            <w:pStyle w:val="12"/>
+            <w:pStyle w:val="TOC3"/>
             <w:ind w:left="720"/>
             <w:tabs>
               <w:tab w:val="right" w:leader="dot" w:pos="9026"/>
@@ -1367,7 +1367,7 @@
         </w:p>
         <w:p>
           <w:pPr>
-            <w:pStyle w:val="11"/>
+            <w:pStyle w:val="TOC2"/>
             <w:ind w:left="360"/>
             <w:tabs>
               <w:tab w:val="right" w:leader="dot" w:pos="9026"/>
@@ -1381,12 +1381,12 @@
             <w:tab/>
           </w:r>
           <w:r>
-            <w:t>21</w:t>
+            <w:t>22</w:t>
           </w:r>
         </w:p>
         <w:p>
           <w:pPr>
-            <w:pStyle w:val="12"/>
+            <w:pStyle w:val="TOC3"/>
             <w:ind w:left="720"/>
             <w:tabs>
               <w:tab w:val="right" w:leader="dot" w:pos="9026"/>
@@ -1400,12 +1400,12 @@
             <w:tab/>
           </w:r>
           <w:r>
-            <w:t>21</w:t>
+            <w:t>22</w:t>
           </w:r>
         </w:p>
         <w:p>
           <w:pPr>
-            <w:pStyle w:val="12"/>
+            <w:pStyle w:val="TOC3"/>
             <w:ind w:left="720"/>
             <w:tabs>
               <w:tab w:val="right" w:leader="dot" w:pos="9026"/>
@@ -1424,7 +1424,7 @@
         </w:p>
         <w:p>
           <w:pPr>
-            <w:pStyle w:val="12"/>
+            <w:pStyle w:val="TOC3"/>
             <w:ind w:left="720"/>
             <w:tabs>
               <w:tab w:val="right" w:leader="dot" w:pos="9026"/>
@@ -1443,7 +1443,7 @@
         </w:p>
         <w:p>
           <w:pPr>
-            <w:pStyle w:val="12"/>
+            <w:pStyle w:val="TOC3"/>
             <w:ind w:left="720"/>
             <w:tabs>
               <w:tab w:val="right" w:leader="dot" w:pos="9026"/>
@@ -1457,12 +1457,12 @@
             <w:tab/>
           </w:r>
           <w:r>
-            <w:t>22</w:t>
+            <w:t>23</w:t>
           </w:r>
         </w:p>
         <w:p>
           <w:pPr>
-            <w:pStyle w:val="12"/>
+            <w:pStyle w:val="TOC3"/>
             <w:ind w:left="720"/>
             <w:tabs>
               <w:tab w:val="right" w:leader="dot" w:pos="9026"/>
@@ -1481,7 +1481,7 @@
         </w:p>
         <w:p>
           <w:pPr>
-            <w:pStyle w:val="12"/>
+            <w:pStyle w:val="TOC3"/>
             <w:ind w:left="720"/>
             <w:tabs>
               <w:tab w:val="right" w:leader="dot" w:pos="9026"/>
@@ -1495,12 +1495,12 @@
             <w:tab/>
           </w:r>
           <w:r>
-            <w:t>23</w:t>
+            <w:t>24</w:t>
           </w:r>
         </w:p>
         <w:p>
           <w:pPr>
-            <w:pStyle w:val="12"/>
+            <w:pStyle w:val="TOC3"/>
             <w:ind w:left="720"/>
             <w:tabs>
               <w:tab w:val="right" w:leader="dot" w:pos="9026"/>
@@ -1519,7 +1519,7 @@
         </w:p>
         <w:p>
           <w:pPr>
-            <w:pStyle w:val="12"/>
+            <w:pStyle w:val="TOC3"/>
             <w:ind w:left="720"/>
             <w:tabs>
               <w:tab w:val="right" w:leader="dot" w:pos="9026"/>
@@ -1538,7 +1538,7 @@
         </w:p>
         <w:p>
           <w:pPr>
-            <w:pStyle w:val="11"/>
+            <w:pStyle w:val="TOC2"/>
             <w:ind w:left="360"/>
             <w:tabs>
               <w:tab w:val="right" w:leader="dot" w:pos="9026"/>
@@ -1552,12 +1552,12 @@
             <w:tab/>
           </w:r>
           <w:r>
-            <w:t>24</w:t>
+            <w:t>25</w:t>
           </w:r>
         </w:p>
         <w:p>
           <w:pPr>
-            <w:pStyle w:val="12"/>
+            <w:pStyle w:val="TOC3"/>
             <w:ind w:left="720"/>
             <w:tabs>
               <w:tab w:val="right" w:leader="dot" w:pos="9026"/>
@@ -1576,7 +1576,7 @@
         </w:p>
         <w:p>
           <w:pPr>
-            <w:pStyle w:val="12"/>
+            <w:pStyle w:val="TOC3"/>
             <w:ind w:left="720"/>
             <w:tabs>
               <w:tab w:val="right" w:leader="dot" w:pos="9026"/>
@@ -1595,7 +1595,7 @@
         </w:p>
         <w:p>
           <w:pPr>
-            <w:pStyle w:val="12"/>
+            <w:pStyle w:val="TOC3"/>
             <w:ind w:left="720"/>
             <w:tabs>
               <w:tab w:val="right" w:leader="dot" w:pos="9026"/>
@@ -1614,7 +1614,7 @@
         </w:p>
         <w:p>
           <w:pPr>
-            <w:pStyle w:val="12"/>
+            <w:pStyle w:val="TOC3"/>
             <w:ind w:left="720"/>
             <w:tabs>
               <w:tab w:val="right" w:leader="dot" w:pos="9026"/>
@@ -1633,7 +1633,7 @@
         </w:p>
         <w:p>
           <w:pPr>
-            <w:pStyle w:val="12"/>
+            <w:pStyle w:val="TOC3"/>
             <w:ind w:left="720"/>
             <w:tabs>
               <w:tab w:val="right" w:leader="dot" w:pos="9026"/>
@@ -1652,7 +1652,7 @@
         </w:p>
         <w:p>
           <w:pPr>
-            <w:pStyle w:val="12"/>
+            <w:pStyle w:val="TOC3"/>
             <w:ind w:left="720"/>
             <w:tabs>
               <w:tab w:val="right" w:leader="dot" w:pos="9026"/>
@@ -1666,12 +1666,12 @@
             <w:tab/>
           </w:r>
           <w:r>
-            <w:t>28</w:t>
+            <w:t>29</w:t>
           </w:r>
         </w:p>
         <w:p>
           <w:pPr>
-            <w:pStyle w:val="12"/>
+            <w:pStyle w:val="TOC3"/>
             <w:ind w:left="720"/>
             <w:tabs>
               <w:tab w:val="right" w:leader="dot" w:pos="9026"/>
@@ -1685,12 +1685,12 @@
             <w:tab/>
           </w:r>
           <w:r>
-            <w:t>29</w:t>
+            <w:t>30</w:t>
           </w:r>
         </w:p>
         <w:p>
           <w:pPr>
-            <w:pStyle w:val="12"/>
+            <w:pStyle w:val="TOC3"/>
             <w:ind w:left="720"/>
             <w:tabs>
               <w:tab w:val="right" w:leader="dot" w:pos="9026"/>
@@ -1709,7 +1709,7 @@
         </w:p>
         <w:p>
           <w:pPr>
-            <w:pStyle w:val="11"/>
+            <w:pStyle w:val="TOC2"/>
             <w:ind w:left="360"/>
             <w:tabs>
               <w:tab w:val="right" w:leader="dot" w:pos="9026"/>
@@ -1723,12 +1723,12 @@
             <w:tab/>
           </w:r>
           <w:r>
-            <w:t>30</w:t>
+            <w:t>31</w:t>
           </w:r>
         </w:p>
         <w:p>
           <w:pPr>
-            <w:pStyle w:val="11"/>
+            <w:pStyle w:val="TOC2"/>
             <w:ind w:left="360"/>
             <w:tabs>
               <w:tab w:val="right" w:leader="dot" w:pos="9026"/>
@@ -1747,7 +1747,7 @@
         </w:p>
         <w:p>
           <w:pPr>
-            <w:pStyle w:val="11"/>
+            <w:pStyle w:val="TOC2"/>
             <w:ind w:left="360"/>
             <w:tabs>
               <w:tab w:val="right" w:leader="dot" w:pos="9026"/>
@@ -1761,12 +1761,12 @@
             <w:tab/>
           </w:r>
           <w:r>
-            <w:t>31</w:t>
+            <w:t>32</w:t>
           </w:r>
         </w:p>
         <w:p>
           <w:pPr>
-            <w:pStyle w:val="9"/>
+            <w:pStyle w:val="TOC1"/>
             <w:tabs>
               <w:tab w:val="right" w:leader="dot" w:pos="9026"/>
             </w:tabs>
@@ -11637,7 +11637,7 @@
           <w:sz w:val="24"/>
           <w:szCs w:val="24"/>
         </w:rPr>
-        <w:t xml:space="preserve"> serta pelatihan guru–murid (T2), uji generalisasi (T3), pengemasan purwarupa dua arah dan uji kegunaan (T4), hingga analisis dan penulisan (T5). Lima tahap pertama ditutup gerbang keputusan G0–G4 seperti ditunjukkan pada Gambar 3.1. Kriteria lolos dan tindakan bila gagal direncanakan ditetapkan sebelum gerbang terkait dinilai; parameter yang belum ditetapkan dihimpun pada Tabel 3.6.</w:t>
+        <w:t xml:space="preserve"> serta pelatihan guru–murid (T2), uji generalisasi (T3), pengemasan purwarupa dua arah dan uji kegunaan (T4), hingga analisis dan penulisan (T5). Lima tahap pertama ditutup gerbang keputusan G0–G4: jalur lolos dirangkum pada Gambar 3.1, sedangkan jalur gagal, tindakan korektif, dan uji ulang tiap gerbang dirinci pada Gambar 3.2. Bila G0 gagal kedua kali setelah perbaikan, jalur CSI dihentikan dan dilaporkan sebagai temuan karakterisasi, lalu penelitian lanjut ke T5; bila G1 gagal kedua kali, tindakan mengikuti Tabel 3.6 dan dicatat sebagai temuan. Kriteria lolos dan tindakan bila gagal direncanakan ditetapkan sebelum gerbang terkait dinilai; parameter yang belum ditetapkan dihimpun pada Tabel 3.6.</w:t>
       </w:r>
     </w:p>
     <w:p>
@@ -11649,9 +11649,9 @@
       <w:r>
         <w:drawing>
           <wp:inline distT="0" distB="0" distL="0" distR="0">
-            <wp:extent cx="4171950" cy="7429500"/>
+            <wp:extent cx="5038725" cy="5172075"/>
             <wp:effectExtent t="0" r="0" b="0" l="0"/>
-            <wp:docPr id="1" name="" descr="" title=""/>
+            <wp:docPr id="1" name=""/>
             <wp:cNvGraphicFramePr>
               <a:graphicFrameLocks xmlns:a="http://schemas.openxmlformats.org/drawingml/2006/main" noChangeAspect="1"/>
             </wp:cNvGraphicFramePr>
@@ -11674,7 +11674,7 @@
                   <pic:spPr bwMode="auto">
                     <a:xfrm>
                       <a:off x="0" y="0"/>
-                      <a:ext cx="4171950" cy="7429500"/>
+                      <a:ext cx="5038725" cy="5172075"/>
                     </a:xfrm>
                     <a:prstGeom prst="rect">
                       <a:avLst/>
@@ -11710,400 +11710,7 @@
           <w:sz w:val="24"/>
           <w:szCs w:val="24"/>
         </w:rPr>
-        <w:t xml:space="preserve"> Tahapan penelitian T0–T5 dengan gerbang keputusan G0–G4</w:t>
-      </w:r>
-    </w:p>
-    <w:p>
-      <w:pPr>
-        <w:pStyle w:val="Heading3"/>
-        <w:spacing w:after="120" w:before="240" w:line="360"/>
-        <w:jc w:val="left"/>
-      </w:pPr>
-      <w:bookmarkStart w:name="_Toc25" w:id="25"/>
-      <w:r>
-        <w:rPr>
-          <w:rFonts w:ascii="Times New Roman" w:eastAsia="Times New Roman" w:hAnsi="Times New Roman"/>
-          <w:b/>
-          <w:bCs/>
-          <w:color w:val="000000"/>
-          <w:sz w:val="24"/>
-          <w:szCs w:val="24"/>
-        </w:rPr>
-        <w:t xml:space="preserve">3.2.1 Tahap T0: Replikasi Platform dan Uji Karakterisasi (M1–M2)</w:t>
-      </w:r>
-      <w:bookmarkEnd w:id="25"/>
-    </w:p>
-    <w:p>
-      <w:pPr>
-        <w:spacing w:after="0" w:line="360"/>
-        <w:ind w:firstLine="709"/>
-        <w:jc w:val="both"/>
-      </w:pPr>
-      <w:r>
-        <w:rPr>
-          <w:rFonts w:ascii="Times New Roman" w:eastAsia="Times New Roman" w:hAnsi="Times New Roman"/>
-          <w:b w:val="false"/>
-          <w:bCs w:val="false"/>
-          <w:i w:val="false"/>
-          <w:iCs w:val="false"/>
-          <w:color w:val="000000"/>
-          <w:sz w:val="24"/>
-          <w:szCs w:val="24"/>
-        </w:rPr>
-        <w:t xml:space="preserve">Dua modul ESP32-S3 disiapkan dengan </w:t>
-      </w:r>
-      <w:r>
-        <w:rPr>
-          <w:rFonts w:ascii="Times New Roman" w:eastAsia="Times New Roman" w:hAnsi="Times New Roman"/>
-          <w:b w:val="false"/>
-          <w:bCs w:val="false"/>
-          <w:i/>
-          <w:iCs/>
-          <w:color w:val="000000"/>
-          <w:sz w:val="24"/>
-          <w:szCs w:val="24"/>
-        </w:rPr>
-        <w:t xml:space="preserve">firmware</w:t>
-      </w:r>
-      <w:r>
-        <w:rPr>
-          <w:rFonts w:ascii="Times New Roman" w:eastAsia="Times New Roman" w:hAnsi="Times New Roman"/>
-          <w:b w:val="false"/>
-          <w:bCs w:val="false"/>
-          <w:i w:val="false"/>
-          <w:iCs w:val="false"/>
-          <w:color w:val="000000"/>
-          <w:sz w:val="24"/>
-          <w:szCs w:val="24"/>
-        </w:rPr>
-        <w:t xml:space="preserve"> RuView [28], lalu </w:t>
-      </w:r>
-      <w:r>
-        <w:rPr>
-          <w:rFonts w:ascii="Times New Roman" w:eastAsia="Times New Roman" w:hAnsi="Times New Roman"/>
-          <w:b w:val="false"/>
-          <w:bCs w:val="false"/>
-          <w:i/>
-          <w:iCs/>
-          <w:color w:val="000000"/>
-          <w:sz w:val="24"/>
-          <w:szCs w:val="24"/>
-        </w:rPr>
-        <w:t xml:space="preserve">pipeline</w:t>
-      </w:r>
-      <w:r>
-        <w:rPr>
-          <w:rFonts w:ascii="Times New Roman" w:eastAsia="Times New Roman" w:hAnsi="Times New Roman"/>
-          <w:b w:val="false"/>
-          <w:bCs w:val="false"/>
-          <w:i w:val="false"/>
-          <w:iCs w:val="false"/>
-          <w:color w:val="000000"/>
-          <w:sz w:val="24"/>
-          <w:szCs w:val="24"/>
-        </w:rPr>
-        <w:t xml:space="preserve"> akuisisi tersinkron diuji tanpa partisipan. Tiga uji dilakukan pada tahap ini. Pertama, uji Delta-CSI (Subbab 3.8.1) untuk mengetahui apakah pola CSI saat bergerak terpisah dari kondisi diam dan ruang kosong. Kedua, uji koeksistensi radio: modul penerima dijalankan dengan penangkapan CSI, koneksi </w:t>
-      </w:r>
-      <w:r>
-        <w:rPr>
-          <w:rFonts w:ascii="Times New Roman" w:eastAsia="Times New Roman" w:hAnsi="Times New Roman"/>
-          <w:b w:val="false"/>
-          <w:bCs w:val="false"/>
-          <w:i/>
-          <w:iCs/>
-          <w:color w:val="000000"/>
-          <w:sz w:val="24"/>
-          <w:szCs w:val="24"/>
-        </w:rPr>
-        <w:t xml:space="preserve">station</w:t>
-      </w:r>
-      <w:r>
-        <w:rPr>
-          <w:rFonts w:ascii="Times New Roman" w:eastAsia="Times New Roman" w:hAnsi="Times New Roman"/>
-          <w:b w:val="false"/>
-          <w:bCs w:val="false"/>
-          <w:i w:val="false"/>
-          <w:iCs w:val="false"/>
-          <w:color w:val="000000"/>
-          <w:sz w:val="24"/>
-          <w:szCs w:val="24"/>
-        </w:rPr>
-        <w:t xml:space="preserve"> ke </w:t>
-      </w:r>
-      <w:r>
-        <w:rPr>
-          <w:rFonts w:ascii="Times New Roman" w:eastAsia="Times New Roman" w:hAnsi="Times New Roman"/>
-          <w:b w:val="false"/>
-          <w:bCs w:val="false"/>
-          <w:i/>
-          <w:iCs/>
-          <w:color w:val="000000"/>
-          <w:sz w:val="24"/>
-          <w:szCs w:val="24"/>
-        </w:rPr>
-        <w:t xml:space="preserve">access point</w:t>
-      </w:r>
-      <w:r>
-        <w:rPr>
-          <w:rFonts w:ascii="Times New Roman" w:eastAsia="Times New Roman" w:hAnsi="Times New Roman"/>
-          <w:b w:val="false"/>
-          <w:bCs w:val="false"/>
-          <w:i w:val="false"/>
-          <w:iCs w:val="false"/>
-          <w:color w:val="000000"/>
-          <w:sz w:val="24"/>
-          <w:szCs w:val="24"/>
-        </w:rPr>
-        <w:t xml:space="preserve">, dan pengiriman UDP secara serentak, lalu laju CSI aktual dan kehilangan paket diukur, termasuk ketika streaming audio dari mikrofon diaktifkan. Ketiga, pengukuran laju pencuplikan aktual sebagai dasar penetapan pita Doppler (Subbab 3.7.1). Keluaran tahap ini adalah laporan karakterisasi sinyal sebagai bahan G0.</w:t>
-      </w:r>
-    </w:p>
-    <w:p>
-      <w:pPr>
-        <w:pStyle w:val="Heading3"/>
-        <w:spacing w:after="120" w:before="240" w:line="360"/>
-        <w:jc w:val="left"/>
-      </w:pPr>
-      <w:bookmarkStart w:name="_Toc26" w:id="26"/>
-      <w:r>
-        <w:rPr>
-          <w:rFonts w:ascii="Times New Roman" w:eastAsia="Times New Roman" w:hAnsi="Times New Roman"/>
-          <w:b/>
-          <w:bCs/>
-          <w:color w:val="000000"/>
-          <w:sz w:val="24"/>
-          <w:szCs w:val="24"/>
-        </w:rPr>
-        <w:t xml:space="preserve">3.2.2 Tahap T1: Kurasi Isyarat, Kalibrasi Ruang, dan Protokol (M2–M4)</w:t>
-      </w:r>
-      <w:bookmarkEnd w:id="26"/>
-    </w:p>
-    <w:p>
-      <w:pPr>
-        <w:spacing w:after="0" w:line="360"/>
-        <w:ind w:firstLine="709"/>
-        <w:jc w:val="both"/>
-      </w:pPr>
-      <w:r>
-        <w:rPr>
-          <w:rFonts w:ascii="Times New Roman" w:eastAsia="Times New Roman" w:hAnsi="Times New Roman"/>
-          <w:b w:val="false"/>
-          <w:bCs w:val="false"/>
-          <w:i w:val="false"/>
-          <w:iCs w:val="false"/>
-          <w:color w:val="000000"/>
-          <w:sz w:val="24"/>
-          <w:szCs w:val="24"/>
-        </w:rPr>
-        <w:t xml:space="preserve">T1 mencakup kurasi 5–8 isyarat bersama validator penutur tunarungu, kalibrasi ruang mitra, penyusunan protokol perekaman dan etika, serta perizinan (Subbab 3.6). Kurasi juga menetapkan himpunan tampilan arah kedua, yaitu isyarat terpilih ditambah 26 huruf dan 9 angka sebagai kosakata ejaan jari (Subbab 2.8). G1 menguji separabilitas awal 2–3 isyarat dengan uji </w:t>
-      </w:r>
-      <w:r>
-        <w:rPr>
-          <w:rFonts w:ascii="Times New Roman" w:eastAsia="Times New Roman" w:hAnsi="Times New Roman"/>
-          <w:b w:val="false"/>
-          <w:bCs w:val="false"/>
-          <w:i/>
-          <w:iCs/>
-          <w:color w:val="000000"/>
-          <w:sz w:val="24"/>
-          <w:szCs w:val="24"/>
-        </w:rPr>
-        <w:t xml:space="preserve">nearest-centroid</w:t>
-      </w:r>
-      <w:r>
-        <w:rPr>
-          <w:rFonts w:ascii="Times New Roman" w:eastAsia="Times New Roman" w:hAnsi="Times New Roman"/>
-          <w:b w:val="false"/>
-          <w:bCs w:val="false"/>
-          <w:i w:val="false"/>
-          <w:iCs w:val="false"/>
-          <w:color w:val="000000"/>
-          <w:sz w:val="24"/>
-          <w:szCs w:val="24"/>
-        </w:rPr>
-        <w:t xml:space="preserve"> sederhana yang rata-ratanya dihitung tanpa repetisi yang sedang diuji.</w:t>
-      </w:r>
-    </w:p>
-    <w:p>
-      <w:pPr>
-        <w:pStyle w:val="Heading3"/>
-        <w:spacing w:after="120" w:before="240" w:line="360"/>
-        <w:jc w:val="left"/>
-      </w:pPr>
-      <w:bookmarkStart w:name="_Toc27" w:id="27"/>
-      <w:r>
-        <w:rPr>
-          <w:rFonts w:ascii="Times New Roman" w:eastAsia="Times New Roman" w:hAnsi="Times New Roman"/>
-          <w:b/>
-          <w:bCs/>
-          <w:color w:val="000000"/>
-          <w:sz w:val="24"/>
-          <w:szCs w:val="24"/>
-        </w:rPr>
-        <w:t xml:space="preserve">3.2.3 Tahap T2: Perekaman Dataset, Pelatihan Guru–Murid, dan Uji Deployment (M4–M8)</w:t>
-      </w:r>
-      <w:bookmarkEnd w:id="27"/>
-    </w:p>
-    <w:p>
-      <w:pPr>
-        <w:spacing w:after="0" w:line="360"/>
-        <w:ind w:firstLine="709"/>
-        <w:jc w:val="both"/>
-      </w:pPr>
-      <w:r>
-        <w:rPr>
-          <w:rFonts w:ascii="Times New Roman" w:eastAsia="Times New Roman" w:hAnsi="Times New Roman"/>
-          <w:b w:val="false"/>
-          <w:bCs w:val="false"/>
-          <w:i/>
-          <w:iCs/>
-          <w:color w:val="000000"/>
-          <w:sz w:val="24"/>
-          <w:szCs w:val="24"/>
-        </w:rPr>
-        <w:t xml:space="preserve">Dataset</w:t>
-      </w:r>
-      <w:r>
-        <w:rPr>
-          <w:rFonts w:ascii="Times New Roman" w:eastAsia="Times New Roman" w:hAnsi="Times New Roman"/>
-          <w:b w:val="false"/>
-          <w:bCs w:val="false"/>
-          <w:i w:val="false"/>
-          <w:iCs w:val="false"/>
-          <w:color w:val="000000"/>
-          <w:sz w:val="24"/>
-          <w:szCs w:val="24"/>
-        </w:rPr>
-        <w:t xml:space="preserve"> direkam dengan kurang lebih 30 repetisi per isyarat per sesi disertai video tersinkron (Subbab 3.6). Alur pelatihan pada tahap ini berbentuk distilasi guru–murid yang ditunjukkan pada Gambar 3.2. Model guru YOLO26-Pose dilatih lanjutan pada data visual SIBI di layanan server GPU Kaggle, lalu kualitas </w:t>
-      </w:r>
-      <w:r>
-        <w:rPr>
-          <w:rFonts w:ascii="Times New Roman" w:eastAsia="Times New Roman" w:hAnsi="Times New Roman"/>
-          <w:b w:val="false"/>
-          <w:bCs w:val="false"/>
-          <w:i/>
-          <w:iCs/>
-          <w:color w:val="000000"/>
-          <w:sz w:val="24"/>
-          <w:szCs w:val="24"/>
-        </w:rPr>
-        <w:t xml:space="preserve">keypoint</w:t>
-      </w:r>
-      <w:r>
-        <w:rPr>
-          <w:rFonts w:ascii="Times New Roman" w:eastAsia="Times New Roman" w:hAnsi="Times New Roman"/>
-          <w:b w:val="false"/>
-          <w:bCs w:val="false"/>
-          <w:i w:val="false"/>
-          <w:iCs w:val="false"/>
-          <w:color w:val="000000"/>
-          <w:sz w:val="24"/>
-          <w:szCs w:val="24"/>
-        </w:rPr>
-        <w:t xml:space="preserve">-nya dievaluasi sebelum dipakai (Subbab 3.7.4). Jendela CSI, label kelas dari anotasi protokol, dan deret pose guru diselaraskan berdasarkan penanda waktu untuk membentuk </w:t>
-      </w:r>
-      <w:r>
-        <w:rPr>
-          <w:rFonts w:ascii="Times New Roman" w:eastAsia="Times New Roman" w:hAnsi="Times New Roman"/>
-          <w:b w:val="false"/>
-          <w:bCs w:val="false"/>
-          <w:i/>
-          <w:iCs/>
-          <w:color w:val="000000"/>
-          <w:sz w:val="24"/>
-          <w:szCs w:val="24"/>
-        </w:rPr>
-        <w:t xml:space="preserve">dataset</w:t>
-      </w:r>
-      <w:r>
-        <w:rPr>
-          <w:rFonts w:ascii="Times New Roman" w:eastAsia="Times New Roman" w:hAnsi="Times New Roman"/>
-          <w:b w:val="false"/>
-          <w:bCs w:val="false"/>
-          <w:i w:val="false"/>
-          <w:iCs w:val="false"/>
-          <w:color w:val="000000"/>
-          <w:sz w:val="24"/>
-          <w:szCs w:val="24"/>
-        </w:rPr>
-        <w:t xml:space="preserve"> murid; kemudian murid 1D-CNN dilatih dengan supervisi label dan deret pose guru (Subbab 3.7.5). Dua pembanding dilatih pada data yang sama, yaitu SVM dan murid ablasi tanpa supervisi guru. Setelah pelatihan, model terpilih dikuantisasi int8, di-</w:t>
-      </w:r>
-      <w:r>
-        <w:rPr>
-          <w:rFonts w:ascii="Times New Roman" w:eastAsia="Times New Roman" w:hAnsi="Times New Roman"/>
-          <w:b w:val="false"/>
-          <w:bCs w:val="false"/>
-          <w:i/>
-          <w:iCs/>
-          <w:color w:val="000000"/>
-          <w:sz w:val="24"/>
-          <w:szCs w:val="24"/>
-        </w:rPr>
-        <w:t xml:space="preserve">deploy</w:t>
-      </w:r>
-      <w:r>
-        <w:rPr>
-          <w:rFonts w:ascii="Times New Roman" w:eastAsia="Times New Roman" w:hAnsi="Times New Roman"/>
-          <w:b w:val="false"/>
-          <w:bCs w:val="false"/>
-          <w:i w:val="false"/>
-          <w:iCs w:val="false"/>
-          <w:color w:val="000000"/>
-          <w:sz w:val="24"/>
-          <w:szCs w:val="24"/>
-        </w:rPr>
-        <w:t xml:space="preserve"> ke modul penerima, lalu diukur waktu inferensi dan pemakaian memorinya pada laju bingkai aktual. Keluaran T2 adalah </w:t>
-      </w:r>
-      <w:r>
-        <w:rPr>
-          <w:rFonts w:ascii="Times New Roman" w:eastAsia="Times New Roman" w:hAnsi="Times New Roman"/>
-          <w:b w:val="false"/>
-          <w:bCs w:val="false"/>
-          <w:i/>
-          <w:iCs/>
-          <w:color w:val="000000"/>
-          <w:sz w:val="24"/>
-          <w:szCs w:val="24"/>
-        </w:rPr>
-        <w:t xml:space="preserve">dataset</w:t>
-      </w:r>
-      <w:r>
-        <w:rPr>
-          <w:rFonts w:ascii="Times New Roman" w:eastAsia="Times New Roman" w:hAnsi="Times New Roman"/>
-          <w:b w:val="false"/>
-          <w:bCs w:val="false"/>
-          <w:i w:val="false"/>
-          <w:iCs w:val="false"/>
-          <w:color w:val="000000"/>
-          <w:sz w:val="24"/>
-          <w:szCs w:val="24"/>
-        </w:rPr>
-        <w:t xml:space="preserve"> murid berlabel, model guru dan murid terlatih, serta laporan </w:t>
-      </w:r>
-      <w:r>
-        <w:rPr>
-          <w:rFonts w:ascii="Times New Roman" w:eastAsia="Times New Roman" w:hAnsi="Times New Roman"/>
-          <w:b w:val="false"/>
-          <w:bCs w:val="false"/>
-          <w:i/>
-          <w:iCs/>
-          <w:color w:val="000000"/>
-          <w:sz w:val="24"/>
-          <w:szCs w:val="24"/>
-        </w:rPr>
-        <w:t xml:space="preserve">deployment</w:t>
-      </w:r>
-      <w:r>
-        <w:rPr>
-          <w:rFonts w:ascii="Times New Roman" w:eastAsia="Times New Roman" w:hAnsi="Times New Roman"/>
-          <w:b w:val="false"/>
-          <w:bCs w:val="false"/>
-          <w:i w:val="false"/>
-          <w:iCs w:val="false"/>
-          <w:color w:val="000000"/>
-          <w:sz w:val="24"/>
-          <w:szCs w:val="24"/>
-        </w:rPr>
-        <w:t xml:space="preserve">; bila G2 gagal, cakupan dipangkas menjadi 3–5 isyarat yang pembedanya paling bertumpu pada lintasan (Tabel 3.6).</w:t>
+        <w:t xml:space="preserve"> Tahapan penelitian T0–T5 dan gerbang keputusan G0–G4 (jalur lolos; jalur gagal dirinci pada Gambar 3.2)</w:t>
       </w:r>
     </w:p>
     <w:p>
@@ -12115,9 +11722,9 @@
       <w:r>
         <w:drawing>
           <wp:inline distT="0" distB="0" distL="0" distR="0">
-            <wp:extent cx="5038725" cy="7419975"/>
+            <wp:extent cx="5038725" cy="6734175"/>
             <wp:effectExtent t="0" r="0" b="0" l="0"/>
-            <wp:docPr id="2" name="" descr="" title=""/>
+            <wp:docPr id="2" name=""/>
             <wp:cNvGraphicFramePr>
               <a:graphicFrameLocks xmlns:a="http://schemas.openxmlformats.org/drawingml/2006/main" noChangeAspect="1"/>
             </wp:cNvGraphicFramePr>
@@ -12140,7 +11747,7 @@
                   <pic:spPr bwMode="auto">
                     <a:xfrm>
                       <a:off x="0" y="0"/>
-                      <a:ext cx="5038725" cy="7419975"/>
+                      <a:ext cx="5038725" cy="6734175"/>
                     </a:xfrm>
                     <a:prstGeom prst="rect">
                       <a:avLst/>
@@ -12176,7 +11783,546 @@
           <w:sz w:val="24"/>
           <w:szCs w:val="24"/>
         </w:rPr>
-        <w:t xml:space="preserve"> Alur pelatihan guru–murid dari perekaman tersinkron hingga deployment</w:t>
+        <w:t xml:space="preserve"> Jalur gagal dan remediasi gerbang keputusan G0–G4. Lingkaran kosong = lanjut ke tahap yang tertera pada label sisi; lingkaran "temuan" = penelitian berlanjut dengan hasil dilaporkan sebagai temuan. Kriteria lengkap tiap gerbang diuraikan pada Subbab 3.2.1–3.2.5 dan parameter yang menyertai pada Tabel 3.6.</w:t>
+      </w:r>
+    </w:p>
+    <w:p>
+      <w:pPr>
+        <w:pStyle w:val="Heading3"/>
+        <w:spacing w:after="120" w:before="240" w:line="360"/>
+        <w:jc w:val="left"/>
+      </w:pPr>
+      <w:bookmarkStart w:name="_Toc25" w:id="25"/>
+      <w:r>
+        <w:rPr>
+          <w:rFonts w:ascii="Times New Roman" w:eastAsia="Times New Roman" w:hAnsi="Times New Roman"/>
+          <w:b/>
+          <w:bCs/>
+          <w:color w:val="000000"/>
+          <w:sz w:val="24"/>
+          <w:szCs w:val="24"/>
+        </w:rPr>
+        <w:t xml:space="preserve">3.2.1 Tahap T0: Replikasi Platform dan Uji Karakterisasi (M1–M2)</w:t>
+      </w:r>
+      <w:bookmarkEnd w:id="25"/>
+    </w:p>
+    <w:p>
+      <w:pPr>
+        <w:spacing w:after="0" w:line="360"/>
+        <w:ind w:firstLine="709"/>
+        <w:jc w:val="both"/>
+      </w:pPr>
+      <w:r>
+        <w:rPr>
+          <w:rFonts w:ascii="Times New Roman" w:eastAsia="Times New Roman" w:hAnsi="Times New Roman"/>
+          <w:b w:val="false"/>
+          <w:bCs w:val="false"/>
+          <w:i w:val="false"/>
+          <w:iCs w:val="false"/>
+          <w:color w:val="000000"/>
+          <w:sz w:val="24"/>
+          <w:szCs w:val="24"/>
+        </w:rPr>
+        <w:t xml:space="preserve">Dua modul ESP32-S3 disiapkan dengan </w:t>
+      </w:r>
+      <w:r>
+        <w:rPr>
+          <w:rFonts w:ascii="Times New Roman" w:eastAsia="Times New Roman" w:hAnsi="Times New Roman"/>
+          <w:b w:val="false"/>
+          <w:bCs w:val="false"/>
+          <w:i/>
+          <w:iCs/>
+          <w:color w:val="000000"/>
+          <w:sz w:val="24"/>
+          <w:szCs w:val="24"/>
+        </w:rPr>
+        <w:t xml:space="preserve">firmware</w:t>
+      </w:r>
+      <w:r>
+        <w:rPr>
+          <w:rFonts w:ascii="Times New Roman" w:eastAsia="Times New Roman" w:hAnsi="Times New Roman"/>
+          <w:b w:val="false"/>
+          <w:bCs w:val="false"/>
+          <w:i w:val="false"/>
+          <w:iCs w:val="false"/>
+          <w:color w:val="000000"/>
+          <w:sz w:val="24"/>
+          <w:szCs w:val="24"/>
+        </w:rPr>
+        <w:t xml:space="preserve"> RuView [28], lalu </w:t>
+      </w:r>
+      <w:r>
+        <w:rPr>
+          <w:rFonts w:ascii="Times New Roman" w:eastAsia="Times New Roman" w:hAnsi="Times New Roman"/>
+          <w:b w:val="false"/>
+          <w:bCs w:val="false"/>
+          <w:i/>
+          <w:iCs/>
+          <w:color w:val="000000"/>
+          <w:sz w:val="24"/>
+          <w:szCs w:val="24"/>
+        </w:rPr>
+        <w:t xml:space="preserve">pipeline</w:t>
+      </w:r>
+      <w:r>
+        <w:rPr>
+          <w:rFonts w:ascii="Times New Roman" w:eastAsia="Times New Roman" w:hAnsi="Times New Roman"/>
+          <w:b w:val="false"/>
+          <w:bCs w:val="false"/>
+          <w:i w:val="false"/>
+          <w:iCs w:val="false"/>
+          <w:color w:val="000000"/>
+          <w:sz w:val="24"/>
+          <w:szCs w:val="24"/>
+        </w:rPr>
+        <w:t xml:space="preserve"> akuisisi tersinkron diuji tanpa partisipan. Tiga uji dilakukan pada tahap ini. Pertama, uji Delta-CSI (Subbab 3.8.1) untuk mengetahui apakah pola CSI saat bergerak terpisah dari kondisi diam dan ruang kosong. Kedua, uji koeksistensi radio: modul penerima dijalankan dengan penangkapan CSI, koneksi </w:t>
+      </w:r>
+      <w:r>
+        <w:rPr>
+          <w:rFonts w:ascii="Times New Roman" w:eastAsia="Times New Roman" w:hAnsi="Times New Roman"/>
+          <w:b w:val="false"/>
+          <w:bCs w:val="false"/>
+          <w:i/>
+          <w:iCs/>
+          <w:color w:val="000000"/>
+          <w:sz w:val="24"/>
+          <w:szCs w:val="24"/>
+        </w:rPr>
+        <w:t xml:space="preserve">station</w:t>
+      </w:r>
+      <w:r>
+        <w:rPr>
+          <w:rFonts w:ascii="Times New Roman" w:eastAsia="Times New Roman" w:hAnsi="Times New Roman"/>
+          <w:b w:val="false"/>
+          <w:bCs w:val="false"/>
+          <w:i w:val="false"/>
+          <w:iCs w:val="false"/>
+          <w:color w:val="000000"/>
+          <w:sz w:val="24"/>
+          <w:szCs w:val="24"/>
+        </w:rPr>
+        <w:t xml:space="preserve"> ke </w:t>
+      </w:r>
+      <w:r>
+        <w:rPr>
+          <w:rFonts w:ascii="Times New Roman" w:eastAsia="Times New Roman" w:hAnsi="Times New Roman"/>
+          <w:b w:val="false"/>
+          <w:bCs w:val="false"/>
+          <w:i/>
+          <w:iCs/>
+          <w:color w:val="000000"/>
+          <w:sz w:val="24"/>
+          <w:szCs w:val="24"/>
+        </w:rPr>
+        <w:t xml:space="preserve">access point</w:t>
+      </w:r>
+      <w:r>
+        <w:rPr>
+          <w:rFonts w:ascii="Times New Roman" w:eastAsia="Times New Roman" w:hAnsi="Times New Roman"/>
+          <w:b w:val="false"/>
+          <w:bCs w:val="false"/>
+          <w:i w:val="false"/>
+          <w:iCs w:val="false"/>
+          <w:color w:val="000000"/>
+          <w:sz w:val="24"/>
+          <w:szCs w:val="24"/>
+        </w:rPr>
+        <w:t xml:space="preserve">, dan pengiriman UDP secara serentak, lalu laju CSI aktual dan kehilangan paket diukur, termasuk ketika streaming audio dari mikrofon diaktifkan. Ketiga, pengukuran laju pencuplikan aktual sebagai dasar penetapan pita Doppler (Subbab 3.7.1). Keluaran tahap ini adalah laporan karakterisasi sinyal sebagai bahan G0.</w:t>
+      </w:r>
+    </w:p>
+    <w:p>
+      <w:pPr>
+        <w:pStyle w:val="Heading3"/>
+        <w:spacing w:after="120" w:before="240" w:line="360"/>
+        <w:jc w:val="left"/>
+      </w:pPr>
+      <w:bookmarkStart w:name="_Toc26" w:id="26"/>
+      <w:r>
+        <w:rPr>
+          <w:rFonts w:ascii="Times New Roman" w:eastAsia="Times New Roman" w:hAnsi="Times New Roman"/>
+          <w:b/>
+          <w:bCs/>
+          <w:color w:val="000000"/>
+          <w:sz w:val="24"/>
+          <w:szCs w:val="24"/>
+        </w:rPr>
+        <w:t xml:space="preserve">3.2.2 Tahap T1: Kurasi Isyarat, Kalibrasi Ruang, dan Protokol (M2–M4)</w:t>
+      </w:r>
+      <w:bookmarkEnd w:id="26"/>
+    </w:p>
+    <w:p>
+      <w:pPr>
+        <w:spacing w:after="0" w:line="360"/>
+        <w:ind w:firstLine="709"/>
+        <w:jc w:val="both"/>
+      </w:pPr>
+      <w:r>
+        <w:rPr>
+          <w:rFonts w:ascii="Times New Roman" w:eastAsia="Times New Roman" w:hAnsi="Times New Roman"/>
+          <w:b w:val="false"/>
+          <w:bCs w:val="false"/>
+          <w:i w:val="false"/>
+          <w:iCs w:val="false"/>
+          <w:color w:val="000000"/>
+          <w:sz w:val="24"/>
+          <w:szCs w:val="24"/>
+        </w:rPr>
+        <w:t xml:space="preserve">T1 mencakup kurasi 5–8 isyarat bersama validator penutur tunarungu, kalibrasi ruang mitra, penyusunan protokol perekaman dan etika, serta perizinan (Subbab 3.6). Kurasi juga menetapkan himpunan tampilan arah kedua, yaitu isyarat terpilih ditambah 26 huruf dan 9 angka sebagai kosakata ejaan jari (Subbab 2.8). G1 menguji separabilitas awal 2–3 isyarat dengan uji </w:t>
+      </w:r>
+      <w:r>
+        <w:rPr>
+          <w:rFonts w:ascii="Times New Roman" w:eastAsia="Times New Roman" w:hAnsi="Times New Roman"/>
+          <w:b w:val="false"/>
+          <w:bCs w:val="false"/>
+          <w:i/>
+          <w:iCs/>
+          <w:color w:val="000000"/>
+          <w:sz w:val="24"/>
+          <w:szCs w:val="24"/>
+        </w:rPr>
+        <w:t xml:space="preserve">nearest-centroid</w:t>
+      </w:r>
+      <w:r>
+        <w:rPr>
+          <w:rFonts w:ascii="Times New Roman" w:eastAsia="Times New Roman" w:hAnsi="Times New Roman"/>
+          <w:b w:val="false"/>
+          <w:bCs w:val="false"/>
+          <w:i w:val="false"/>
+          <w:iCs w:val="false"/>
+          <w:color w:val="000000"/>
+          <w:sz w:val="24"/>
+          <w:szCs w:val="24"/>
+        </w:rPr>
+        <w:t xml:space="preserve"> sederhana yang rata-ratanya dihitung tanpa repetisi yang sedang diuji.</w:t>
+      </w:r>
+    </w:p>
+    <w:p>
+      <w:pPr>
+        <w:pStyle w:val="Heading3"/>
+        <w:spacing w:after="120" w:before="240" w:line="360"/>
+        <w:jc w:val="left"/>
+      </w:pPr>
+      <w:bookmarkStart w:name="_Toc27" w:id="27"/>
+      <w:r>
+        <w:rPr>
+          <w:rFonts w:ascii="Times New Roman" w:eastAsia="Times New Roman" w:hAnsi="Times New Roman"/>
+          <w:b/>
+          <w:bCs/>
+          <w:color w:val="000000"/>
+          <w:sz w:val="24"/>
+          <w:szCs w:val="24"/>
+        </w:rPr>
+        <w:t xml:space="preserve">3.2.3 Tahap T2: Perekaman Dataset, Pelatihan Guru–Murid, dan Uji Deployment (M4–M8)</w:t>
+      </w:r>
+      <w:bookmarkEnd w:id="27"/>
+    </w:p>
+    <w:p>
+      <w:pPr>
+        <w:spacing w:after="0" w:line="360"/>
+        <w:ind w:firstLine="709"/>
+        <w:jc w:val="both"/>
+      </w:pPr>
+      <w:r>
+        <w:rPr>
+          <w:rFonts w:ascii="Times New Roman" w:eastAsia="Times New Roman" w:hAnsi="Times New Roman"/>
+          <w:b w:val="false"/>
+          <w:bCs w:val="false"/>
+          <w:i/>
+          <w:iCs/>
+          <w:color w:val="000000"/>
+          <w:sz w:val="24"/>
+          <w:szCs w:val="24"/>
+        </w:rPr>
+        <w:t xml:space="preserve">Dataset</w:t>
+      </w:r>
+      <w:r>
+        <w:rPr>
+          <w:rFonts w:ascii="Times New Roman" w:eastAsia="Times New Roman" w:hAnsi="Times New Roman"/>
+          <w:b w:val="false"/>
+          <w:bCs w:val="false"/>
+          <w:i w:val="false"/>
+          <w:iCs w:val="false"/>
+          <w:color w:val="000000"/>
+          <w:sz w:val="24"/>
+          <w:szCs w:val="24"/>
+        </w:rPr>
+        <w:t xml:space="preserve"> direkam dengan kurang lebih 30 repetisi per isyarat per sesi disertai video tersinkron (Subbab 3.6). Alur pelatihan pada tahap ini berbentuk distilasi guru–murid: tahap perekaman, penyaringan segmen, pelatihan guru, dan penyandingan data ditunjukkan pada Gambar 3.3, sedangkan pelatihan murid, pembanding, dan deployment ditunjukkan pada Gambar 3.4. Model guru YOLO26-Pose dilatih lanjutan pada data visual SIBI di layanan server GPU Kaggle, lalu kualitas </w:t>
+      </w:r>
+      <w:r>
+        <w:rPr>
+          <w:rFonts w:ascii="Times New Roman" w:eastAsia="Times New Roman" w:hAnsi="Times New Roman"/>
+          <w:b w:val="false"/>
+          <w:bCs w:val="false"/>
+          <w:i/>
+          <w:iCs/>
+          <w:color w:val="000000"/>
+          <w:sz w:val="24"/>
+          <w:szCs w:val="24"/>
+        </w:rPr>
+        <w:t xml:space="preserve">keypoint</w:t>
+      </w:r>
+      <w:r>
+        <w:rPr>
+          <w:rFonts w:ascii="Times New Roman" w:eastAsia="Times New Roman" w:hAnsi="Times New Roman"/>
+          <w:b w:val="false"/>
+          <w:bCs w:val="false"/>
+          <w:i w:val="false"/>
+          <w:iCs w:val="false"/>
+          <w:color w:val="000000"/>
+          <w:sz w:val="24"/>
+          <w:szCs w:val="24"/>
+        </w:rPr>
+        <w:t xml:space="preserve">-nya dievaluasi sebelum dipakai (Subbab 3.7.4). Jendela CSI, label kelas dari anotasi protokol, dan deret pose guru diselaraskan berdasarkan penanda waktu untuk membentuk </w:t>
+      </w:r>
+      <w:r>
+        <w:rPr>
+          <w:rFonts w:ascii="Times New Roman" w:eastAsia="Times New Roman" w:hAnsi="Times New Roman"/>
+          <w:b w:val="false"/>
+          <w:bCs w:val="false"/>
+          <w:i/>
+          <w:iCs/>
+          <w:color w:val="000000"/>
+          <w:sz w:val="24"/>
+          <w:szCs w:val="24"/>
+        </w:rPr>
+        <w:t xml:space="preserve">dataset</w:t>
+      </w:r>
+      <w:r>
+        <w:rPr>
+          <w:rFonts w:ascii="Times New Roman" w:eastAsia="Times New Roman" w:hAnsi="Times New Roman"/>
+          <w:b w:val="false"/>
+          <w:bCs w:val="false"/>
+          <w:i w:val="false"/>
+          <w:iCs w:val="false"/>
+          <w:color w:val="000000"/>
+          <w:sz w:val="24"/>
+          <w:szCs w:val="24"/>
+        </w:rPr>
+        <w:t xml:space="preserve"> murid; kemudian murid 1D-CNN dilatih dengan supervisi label dan deret pose guru (Subbab 3.7.5). Dua pembanding dilatih pada data yang sama, yaitu SVM dan murid ablasi tanpa supervisi guru. Setelah pelatihan, model terpilih dikuantisasi int8, di-</w:t>
+      </w:r>
+      <w:r>
+        <w:rPr>
+          <w:rFonts w:ascii="Times New Roman" w:eastAsia="Times New Roman" w:hAnsi="Times New Roman"/>
+          <w:b w:val="false"/>
+          <w:bCs w:val="false"/>
+          <w:i/>
+          <w:iCs/>
+          <w:color w:val="000000"/>
+          <w:sz w:val="24"/>
+          <w:szCs w:val="24"/>
+        </w:rPr>
+        <w:t xml:space="preserve">deploy</w:t>
+      </w:r>
+      <w:r>
+        <w:rPr>
+          <w:rFonts w:ascii="Times New Roman" w:eastAsia="Times New Roman" w:hAnsi="Times New Roman"/>
+          <w:b w:val="false"/>
+          <w:bCs w:val="false"/>
+          <w:i w:val="false"/>
+          <w:iCs w:val="false"/>
+          <w:color w:val="000000"/>
+          <w:sz w:val="24"/>
+          <w:szCs w:val="24"/>
+        </w:rPr>
+        <w:t xml:space="preserve"> ke modul penerima, lalu diukur waktu inferensi dan pemakaian memorinya pada laju bingkai aktual. Keluaran T2 adalah </w:t>
+      </w:r>
+      <w:r>
+        <w:rPr>
+          <w:rFonts w:ascii="Times New Roman" w:eastAsia="Times New Roman" w:hAnsi="Times New Roman"/>
+          <w:b w:val="false"/>
+          <w:bCs w:val="false"/>
+          <w:i/>
+          <w:iCs/>
+          <w:color w:val="000000"/>
+          <w:sz w:val="24"/>
+          <w:szCs w:val="24"/>
+        </w:rPr>
+        <w:t xml:space="preserve">dataset</w:t>
+      </w:r>
+      <w:r>
+        <w:rPr>
+          <w:rFonts w:ascii="Times New Roman" w:eastAsia="Times New Roman" w:hAnsi="Times New Roman"/>
+          <w:b w:val="false"/>
+          <w:bCs w:val="false"/>
+          <w:i w:val="false"/>
+          <w:iCs w:val="false"/>
+          <w:color w:val="000000"/>
+          <w:sz w:val="24"/>
+          <w:szCs w:val="24"/>
+        </w:rPr>
+        <w:t xml:space="preserve"> murid berlabel, model guru dan murid terlatih, serta laporan </w:t>
+      </w:r>
+      <w:r>
+        <w:rPr>
+          <w:rFonts w:ascii="Times New Roman" w:eastAsia="Times New Roman" w:hAnsi="Times New Roman"/>
+          <w:b w:val="false"/>
+          <w:bCs w:val="false"/>
+          <w:i/>
+          <w:iCs/>
+          <w:color w:val="000000"/>
+          <w:sz w:val="24"/>
+          <w:szCs w:val="24"/>
+        </w:rPr>
+        <w:t xml:space="preserve">deployment</w:t>
+      </w:r>
+      <w:r>
+        <w:rPr>
+          <w:rFonts w:ascii="Times New Roman" w:eastAsia="Times New Roman" w:hAnsi="Times New Roman"/>
+          <w:b w:val="false"/>
+          <w:bCs w:val="false"/>
+          <w:i w:val="false"/>
+          <w:iCs w:val="false"/>
+          <w:color w:val="000000"/>
+          <w:sz w:val="24"/>
+          <w:szCs w:val="24"/>
+        </w:rPr>
+        <w:t xml:space="preserve">; bila G2 gagal, cakupan dipangkas menjadi 3–5 isyarat yang pembedanya paling bertumpu pada lintasan (Tabel 3.6).</w:t>
+      </w:r>
+    </w:p>
+    <w:p>
+      <w:pPr>
+        <w:keepNext/>
+        <w:spacing w:after="60" w:before="240"/>
+        <w:jc w:val="center"/>
+      </w:pPr>
+      <w:r>
+        <w:drawing>
+          <wp:inline distT="0" distB="0" distL="0" distR="0">
+            <wp:extent cx="5038725" cy="4295775"/>
+            <wp:effectExtent t="0" r="0" b="0" l="0"/>
+            <wp:docPr id="3" name=""/>
+            <wp:cNvGraphicFramePr>
+              <a:graphicFrameLocks xmlns:a="http://schemas.openxmlformats.org/drawingml/2006/main" noChangeAspect="1"/>
+            </wp:cNvGraphicFramePr>
+            <a:graphic xmlns:a="http://schemas.openxmlformats.org/drawingml/2006/main">
+              <a:graphicData uri="http://schemas.openxmlformats.org/drawingml/2006/picture">
+                <pic:pic xmlns:pic="http://schemas.openxmlformats.org/drawingml/2006/picture">
+                  <pic:nvPicPr>
+                    <pic:cNvPr id="0" name="" descr=""/>
+                    <pic:cNvPicPr>
+                      <a:picLocks noChangeAspect="1" noChangeArrowheads="1"/>
+                    </pic:cNvPicPr>
+                  </pic:nvPicPr>
+                  <pic:blipFill>
+                    <a:blip r:embed="rId11" cstate="none"/>
+                    <a:srcRect/>
+                    <a:stretch>
+                      <a:fillRect/>
+                    </a:stretch>
+                  </pic:blipFill>
+                  <pic:spPr bwMode="auto">
+                    <a:xfrm>
+                      <a:off x="0" y="0"/>
+                      <a:ext cx="5038725" cy="4295775"/>
+                    </a:xfrm>
+                    <a:prstGeom prst="rect">
+                      <a:avLst/>
+                    </a:prstGeom>
+                  </pic:spPr>
+                </pic:pic>
+              </a:graphicData>
+            </a:graphic>
+          </wp:inline>
+        </w:drawing>
+      </w:r>
+    </w:p>
+    <w:p>
+      <w:pPr>
+        <w:spacing w:after="240" w:line="360"/>
+        <w:jc w:val="center"/>
+      </w:pPr>
+      <w:r>
+        <w:rPr>
+          <w:rFonts w:ascii="Times New Roman" w:eastAsia="Times New Roman" w:hAnsi="Times New Roman"/>
+          <w:b/>
+          <w:bCs/>
+          <w:color w:val="000000"/>
+          <w:sz w:val="24"/>
+          <w:szCs w:val="24"/>
+        </w:rPr>
+        <w:t xml:space="preserve">Gambar 3.3</w:t>
+      </w:r>
+      <w:r>
+        <w:rPr>
+          <w:rFonts w:ascii="Times New Roman" w:eastAsia="Times New Roman" w:hAnsi="Times New Roman"/>
+          <w:color w:val="000000"/>
+          <w:sz w:val="24"/>
+          <w:szCs w:val="24"/>
+        </w:rPr>
+        <w:t xml:space="preserve"> Distilasi guru–murid tahap data: perekaman tersinkron, penyaringan segmen, model guru, dan penyandingan berbasis waktu</w:t>
+      </w:r>
+    </w:p>
+    <w:p>
+      <w:pPr>
+        <w:keepNext/>
+        <w:spacing w:after="60" w:before="240"/>
+        <w:jc w:val="center"/>
+      </w:pPr>
+      <w:r>
+        <w:drawing>
+          <wp:inline distT="0" distB="0" distL="0" distR="0">
+            <wp:extent cx="5038725" cy="6276975"/>
+            <wp:effectExtent t="0" r="0" b="0" l="0"/>
+            <wp:docPr id="4" name=""/>
+            <wp:cNvGraphicFramePr>
+              <a:graphicFrameLocks xmlns:a="http://schemas.openxmlformats.org/drawingml/2006/main" noChangeAspect="1"/>
+            </wp:cNvGraphicFramePr>
+            <a:graphic xmlns:a="http://schemas.openxmlformats.org/drawingml/2006/main">
+              <a:graphicData uri="http://schemas.openxmlformats.org/drawingml/2006/picture">
+                <pic:pic xmlns:pic="http://schemas.openxmlformats.org/drawingml/2006/picture">
+                  <pic:nvPicPr>
+                    <pic:cNvPr id="0" name="" descr=""/>
+                    <pic:cNvPicPr>
+                      <a:picLocks noChangeAspect="1" noChangeArrowheads="1"/>
+                    </pic:cNvPicPr>
+                  </pic:nvPicPr>
+                  <pic:blipFill>
+                    <a:blip r:embed="rId12" cstate="none"/>
+                    <a:srcRect/>
+                    <a:stretch>
+                      <a:fillRect/>
+                    </a:stretch>
+                  </pic:blipFill>
+                  <pic:spPr bwMode="auto">
+                    <a:xfrm>
+                      <a:off x="0" y="0"/>
+                      <a:ext cx="5038725" cy="6276975"/>
+                    </a:xfrm>
+                    <a:prstGeom prst="rect">
+                      <a:avLst/>
+                    </a:prstGeom>
+                  </pic:spPr>
+                </pic:pic>
+              </a:graphicData>
+            </a:graphic>
+          </wp:inline>
+        </w:drawing>
+      </w:r>
+    </w:p>
+    <w:p>
+      <w:pPr>
+        <w:spacing w:after="240" w:line="360"/>
+        <w:jc w:val="center"/>
+      </w:pPr>
+      <w:r>
+        <w:rPr>
+          <w:rFonts w:ascii="Times New Roman" w:eastAsia="Times New Roman" w:hAnsi="Times New Roman"/>
+          <w:b/>
+          <w:bCs/>
+          <w:color w:val="000000"/>
+          <w:sz w:val="24"/>
+          <w:szCs w:val="24"/>
+        </w:rPr>
+        <w:t xml:space="preserve">Gambar 3.4</w:t>
+      </w:r>
+      <w:r>
+        <w:rPr>
+          <w:rFonts w:ascii="Times New Roman" w:eastAsia="Times New Roman" w:hAnsi="Times New Roman"/>
+          <w:color w:val="000000"/>
+          <w:sz w:val="24"/>
+          <w:szCs w:val="24"/>
+        </w:rPr>
+        <w:t xml:space="preserve"> Distilasi guru–murid tahap pelatihan: dataset murid ber-supervisi guru, pembanding, gerbang kinerja, dan deployment</w:t>
       </w:r>
     </w:p>
     <w:p>
@@ -16022,7 +16168,7 @@
           <w:sz w:val="24"/>
           <w:szCs w:val="24"/>
         </w:rPr>
-        <w:t xml:space="preserve">Sistem dirancang dalam dua jalur operasional tanpa kamera dan satu jalur guru yang hanya aktif saat akuisisi data dan pelatihan, seperti ditunjukkan pada Gambar 3.3. Pada jalur arah pertama, modul pemancar memancarkan bingkai bersama; gerak pengisyarat mengubah deret CSI pada modul penerima; model murid int8 berjalan pada modul dan menghasilkan label beserta skor keyakinan; label dipetakan menjadi teks Indonesia melalui kamus kecil pada modul; teks tampil di layar modul pengguna, lalu dikirim ke layanan TTS awan; audio hasil sintesis diputar pada </w:t>
+        <w:t xml:space="preserve">Sistem dirancang dalam dua jalur operasional tanpa kamera dan satu jalur guru yang hanya aktif saat akuisisi data dan pelatihan, seperti ditunjukkan pada Gambar 3.5. Pada jalur arah pertama, modul pemancar memancarkan bingkai bersama; gerak pengisyarat mengubah deret CSI pada modul penerima; model murid int8 berjalan pada modul dan menghasilkan label beserta skor keyakinan; label dipetakan menjadi teks Indonesia melalui kamus kecil pada modul; teks tampil di layar modul pengguna, lalu dikirim ke layanan TTS awan; audio hasil sintesis diputar pada </w:t>
       </w:r>
       <w:r>
         <w:rPr>
@@ -16112,9 +16258,9 @@
       <w:r>
         <w:drawing>
           <wp:inline distT="0" distB="0" distL="0" distR="0">
-            <wp:extent cx="5038725" cy="5191125"/>
+            <wp:extent cx="5038725" cy="5629275"/>
             <wp:effectExtent t="0" r="0" b="0" l="0"/>
-            <wp:docPr id="3" name="" descr="" title=""/>
+            <wp:docPr id="5" name=""/>
             <wp:cNvGraphicFramePr>
               <a:graphicFrameLocks xmlns:a="http://schemas.openxmlformats.org/drawingml/2006/main" noChangeAspect="1"/>
             </wp:cNvGraphicFramePr>
@@ -16128,7 +16274,7 @@
                     </pic:cNvPicPr>
                   </pic:nvPicPr>
                   <pic:blipFill>
-                    <a:blip r:embed="rId11" cstate="none"/>
+                    <a:blip r:embed="rId13" cstate="none"/>
                     <a:srcRect/>
                     <a:stretch>
                       <a:fillRect/>
@@ -16137,7 +16283,7 @@
                   <pic:spPr bwMode="auto">
                     <a:xfrm>
                       <a:off x="0" y="0"/>
-                      <a:ext cx="5038725" cy="5191125"/>
+                      <a:ext cx="5038725" cy="5629275"/>
                     </a:xfrm>
                     <a:prstGeom prst="rect">
                       <a:avLst/>
@@ -16164,16 +16310,16 @@
           <w:sz w:val="24"/>
           <w:szCs w:val="24"/>
         </w:rPr>
-        <w:t xml:space="preserve">Gambar 3.3</w:t>
-      </w:r>
-      <w:r>
-        <w:rPr>
-          <w:rFonts w:ascii="Times New Roman" w:eastAsia="Times New Roman" w:hAnsi="Times New Roman"/>
-          <w:color w:val="000000"/>
-          <w:sz w:val="24"/>
-          <w:szCs w:val="24"/>
-        </w:rPr>
-        <w:t xml:space="preserve"> Arsitektur produk akhir tanpa kamera</w:t>
+        <w:t xml:space="preserve">Gambar 3.5</w:t>
+      </w:r>
+      <w:r>
+        <w:rPr>
+          <w:rFonts w:ascii="Times New Roman" w:eastAsia="Times New Roman" w:hAnsi="Times New Roman"/>
+          <w:color w:val="000000"/>
+          <w:sz w:val="24"/>
+          <w:szCs w:val="24"/>
+        </w:rPr>
+        <w:t xml:space="preserve"> Arsitektur produk akhir tanpa kamera. Rantai kiri = arah 1 (isyarat menjadi teks dan suara); rantai tengah = arah 2 (ucapan menjadi representasi SIBI); rantai kanan = jalur guru yang hanya aktif saat akuisisi data dan pelatihan; garis putus-putus = beralih ke server lokal ketika internet tidak tersedia.</w:t>
       </w:r>
     </w:p>
     <w:p>
@@ -16213,7 +16359,7 @@
           <w:sz w:val="24"/>
           <w:szCs w:val="24"/>
         </w:rPr>
-        <w:t xml:space="preserve">Topologi jaringan purwarupa ditunjukkan pada Gambar 3.4. Seluruh perangkat, yaitu 2–3 modul dan server laptop, terhubung ke satu </w:t>
+        <w:t xml:space="preserve">Topologi jaringan purwarupa ditunjukkan pada Gambar 3.6. Seluruh perangkat, yaitu 2–3 modul dan server laptop, terhubung ke satu </w:t>
       </w:r>
       <w:r>
         <w:rPr>
@@ -16329,9 +16475,9 @@
       <w:r>
         <w:drawing>
           <wp:inline distT="0" distB="0" distL="0" distR="0">
-            <wp:extent cx="5038725" cy="5743575"/>
+            <wp:extent cx="5038725" cy="6610350"/>
             <wp:effectExtent t="0" r="0" b="0" l="0"/>
-            <wp:docPr id="4" name="" descr="" title=""/>
+            <wp:docPr id="6" name=""/>
             <wp:cNvGraphicFramePr>
               <a:graphicFrameLocks xmlns:a="http://schemas.openxmlformats.org/drawingml/2006/main" noChangeAspect="1"/>
             </wp:cNvGraphicFramePr>
@@ -16345,7 +16491,7 @@
                     </pic:cNvPicPr>
                   </pic:nvPicPr>
                   <pic:blipFill>
-                    <a:blip r:embed="rId12" cstate="none"/>
+                    <a:blip r:embed="rId14" cstate="none"/>
                     <a:srcRect/>
                     <a:stretch>
                       <a:fillRect/>
@@ -16354,7 +16500,7 @@
                   <pic:spPr bwMode="auto">
                     <a:xfrm>
                       <a:off x="0" y="0"/>
-                      <a:ext cx="5038725" cy="5743575"/>
+                      <a:ext cx="5038725" cy="6610350"/>
                     </a:xfrm>
                     <a:prstGeom prst="rect">
                       <a:avLst/>
@@ -16381,7 +16527,7 @@
           <w:sz w:val="24"/>
           <w:szCs w:val="24"/>
         </w:rPr>
-        <w:t xml:space="preserve">Gambar 3.4</w:t>
+        <w:t xml:space="preserve">Gambar 3.6</w:t>
       </w:r>
       <w:r>
         <w:rPr>
@@ -19244,7 +19390,85 @@
           <w:sz w:val="24"/>
           <w:szCs w:val="24"/>
         </w:rPr>
-        <w:t xml:space="preserve">Model murid terpilih dikuantisasi int8 lalu dijalankan pada modul penerima melalui TensorFlow Lite Micro atau ESP-DL dengan penyangga pada PSRAM. Alur inferensi pada perangkat ditunjukkan pada Gambar 3.5: bingkai CSI dari mode promiscuous masuk ke penyangga geser, segmen terdeteksi dari energi gerak, fitur dihitung, model int8 menghasilkan kelas beserta skor, dan keluaran di atas ambang dikirim melalui UDP. Waktu inferensi per segmen, pemakaian memori, dan pengaruhnya terhadap laju pemrosesan bingkai diukur dan dilaporkan; bila model terbukti terlalu berat untuk dijalankan pada perangkat, klasifikasi dipindahkan ke server sesuai jalur cadangan (Subbab 3.11).</w:t>
+        <w:t xml:space="preserve">Model murid terpilih dikuantisasi int8 lalu dijalankan pada modul penerima melalui TensorFlow Lite Micro atau ESP-DL dengan penyangga pada PSRAM. Selama penangkapan CSI, radio modul terikat pada satu kanal bersama </w:t>
+      </w:r>
+      <w:r>
+        <w:rPr>
+          <w:rFonts w:ascii="Times New Roman" w:eastAsia="Times New Roman" w:hAnsi="Times New Roman"/>
+          <w:b w:val="false"/>
+          <w:bCs w:val="false"/>
+          <w:i/>
+          <w:iCs/>
+          <w:color w:val="000000"/>
+          <w:sz w:val="24"/>
+          <w:szCs w:val="24"/>
+        </w:rPr>
+        <w:t xml:space="preserve">access point</w:t>
+      </w:r>
+      <w:r>
+        <w:rPr>
+          <w:rFonts w:ascii="Times New Roman" w:eastAsia="Times New Roman" w:hAnsi="Times New Roman"/>
+          <w:b w:val="false"/>
+          <w:bCs w:val="false"/>
+          <w:i w:val="false"/>
+          <w:iCs w:val="false"/>
+          <w:color w:val="000000"/>
+          <w:sz w:val="24"/>
+          <w:szCs w:val="24"/>
+        </w:rPr>
+        <w:t xml:space="preserve"> dengan </w:t>
+      </w:r>
+      <w:r>
+        <w:rPr>
+          <w:rFonts w:ascii="Times New Roman" w:eastAsia="Times New Roman" w:hAnsi="Times New Roman"/>
+          <w:b w:val="false"/>
+          <w:bCs w:val="false"/>
+          <w:i/>
+          <w:iCs/>
+          <w:color w:val="000000"/>
+          <w:sz w:val="24"/>
+          <w:szCs w:val="24"/>
+        </w:rPr>
+        <w:t xml:space="preserve">power save</w:t>
+      </w:r>
+      <w:r>
+        <w:rPr>
+          <w:rFonts w:ascii="Times New Roman" w:eastAsia="Times New Roman" w:hAnsi="Times New Roman"/>
+          <w:b w:val="false"/>
+          <w:bCs w:val="false"/>
+          <w:i w:val="false"/>
+          <w:iCs w:val="false"/>
+          <w:color w:val="000000"/>
+          <w:sz w:val="24"/>
+          <w:szCs w:val="24"/>
+        </w:rPr>
+        <w:t xml:space="preserve"> dimatikan (WIFI_PS_NONE) [28], sebagaimana dipakai </w:t>
+      </w:r>
+      <w:r>
+        <w:rPr>
+          <w:rFonts w:ascii="Times New Roman" w:eastAsia="Times New Roman" w:hAnsi="Times New Roman"/>
+          <w:b w:val="false"/>
+          <w:bCs w:val="false"/>
+          <w:i/>
+          <w:iCs/>
+          <w:color w:val="000000"/>
+          <w:sz w:val="24"/>
+          <w:szCs w:val="24"/>
+        </w:rPr>
+        <w:t xml:space="preserve">firmware</w:t>
+      </w:r>
+      <w:r>
+        <w:rPr>
+          <w:rFonts w:ascii="Times New Roman" w:eastAsia="Times New Roman" w:hAnsi="Times New Roman"/>
+          <w:b w:val="false"/>
+          <w:bCs w:val="false"/>
+          <w:i w:val="false"/>
+          <w:iCs w:val="false"/>
+          <w:color w:val="000000"/>
+          <w:sz w:val="24"/>
+          <w:szCs w:val="24"/>
+        </w:rPr>
+        <w:t xml:space="preserve"> RuView. Alur inferensi pada perangkat ditunjukkan pada Gambar 3.7: bingkai CSI dari mode promiscuous masuk ke penyangga geser, segmen terdeteksi dari energi gerak, fitur dihitung, model int8 menghasilkan kelas beserta skor, dan keluaran di atas ambang dikirim melalui UDP. Waktu inferensi per segmen, pemakaian memori, dan pengaruhnya terhadap laju pemrosesan bingkai diukur dan dilaporkan; bila model terbukti terlalu berat untuk dijalankan pada perangkat, klasifikasi dipindahkan ke server sesuai jalur cadangan (Subbab 3.11).</w:t>
       </w:r>
     </w:p>
     <w:p>
@@ -19256,9 +19480,9 @@
       <w:r>
         <w:drawing>
           <wp:inline distT="0" distB="0" distL="0" distR="0">
-            <wp:extent cx="5038725" cy="6067425"/>
+            <wp:extent cx="5038725" cy="3743325"/>
             <wp:effectExtent t="0" r="0" b="0" l="0"/>
-            <wp:docPr id="5" name="" descr="" title=""/>
+            <wp:docPr id="7" name=""/>
             <wp:cNvGraphicFramePr>
               <a:graphicFrameLocks xmlns:a="http://schemas.openxmlformats.org/drawingml/2006/main" noChangeAspect="1"/>
             </wp:cNvGraphicFramePr>
@@ -19272,7 +19496,7 @@
                     </pic:cNvPicPr>
                   </pic:nvPicPr>
                   <pic:blipFill>
-                    <a:blip r:embed="rId13" cstate="none"/>
+                    <a:blip r:embed="rId15" cstate="none"/>
                     <a:srcRect/>
                     <a:stretch>
                       <a:fillRect/>
@@ -19281,7 +19505,7 @@
                   <pic:spPr bwMode="auto">
                     <a:xfrm>
                       <a:off x="0" y="0"/>
-                      <a:ext cx="5038725" cy="6067425"/>
+                      <a:ext cx="5038725" cy="3743325"/>
                     </a:xfrm>
                     <a:prstGeom prst="rect">
                       <a:avLst/>
@@ -19308,7 +19532,7 @@
           <w:sz w:val="24"/>
           <w:szCs w:val="24"/>
         </w:rPr>
-        <w:t xml:space="preserve">Gambar 3.5</w:t>
+        <w:t xml:space="preserve">Gambar 3.7</w:t>
       </w:r>
       <w:r>
         <w:rPr>
@@ -19383,33 +19607,7 @@
           <w:sz w:val="24"/>
           <w:szCs w:val="24"/>
         </w:rPr>
-        <w:t xml:space="preserve"> mendasari G1, uji klasifikasi mendasari G2 dan G3, serta uji kegunaan dan penilaian validator mendasari G4. Uji operasional, uji jalur ucapan, dan uji cakupan kamus melengkapi analisis tanpa menjadi syarat gerbang. Rantai lengkap dari </w:t>
-      </w:r>
-      <w:r>
-        <w:rPr>
-          <w:rFonts w:ascii="Times New Roman" w:eastAsia="Times New Roman" w:hAnsi="Times New Roman"/>
-          <w:b w:val="false"/>
-          <w:bCs w:val="false"/>
-          <w:i/>
-          <w:iCs/>
-          <w:color w:val="000000"/>
-          <w:sz w:val="24"/>
-          <w:szCs w:val="24"/>
-        </w:rPr>
-        <w:t xml:space="preserve">dataset</w:t>
-      </w:r>
-      <w:r>
-        <w:rPr>
-          <w:rFonts w:ascii="Times New Roman" w:eastAsia="Times New Roman" w:hAnsi="Times New Roman"/>
-          <w:b w:val="false"/>
-          <w:bCs w:val="false"/>
-          <w:i w:val="false"/>
-          <w:iCs w:val="false"/>
-          <w:color w:val="000000"/>
-          <w:sz w:val="24"/>
-          <w:szCs w:val="24"/>
-        </w:rPr>
-        <w:t xml:space="preserve"> hingga pengemasan ditunjukkan pada Gambar 3.6.</w:t>
+        <w:t xml:space="preserve"> mendasari G1, uji klasifikasi mendasari G2 dan G3, serta uji kegunaan dan penilaian validator mendasari G4. Uji operasional, uji jalur ucapan, dan uji cakupan kamus melengkapi analisis tanpa menjadi syarat gerbang. Rantai perekaman hingga pelatihan telah ditunjukkan pada Gambar 3.3 dan Gambar 3.4, sedangkan rantai evaluasi dari model terpilih hingga artefak akhir ditunjukkan pada Gambar 3.8.</w:t>
       </w:r>
     </w:p>
     <w:p>
@@ -19421,9 +19619,9 @@
       <w:r>
         <w:drawing>
           <wp:inline distT="0" distB="0" distL="0" distR="0">
-            <wp:extent cx="5038725" cy="5876925"/>
+            <wp:extent cx="5038725" cy="6667500"/>
             <wp:effectExtent t="0" r="0" b="0" l="0"/>
-            <wp:docPr id="6" name="" descr="" title=""/>
+            <wp:docPr id="8" name=""/>
             <wp:cNvGraphicFramePr>
               <a:graphicFrameLocks xmlns:a="http://schemas.openxmlformats.org/drawingml/2006/main" noChangeAspect="1"/>
             </wp:cNvGraphicFramePr>
@@ -19437,7 +19635,7 @@
                     </pic:cNvPicPr>
                   </pic:nvPicPr>
                   <pic:blipFill>
-                    <a:blip r:embed="rId14" cstate="none"/>
+                    <a:blip r:embed="rId16" cstate="none"/>
                     <a:srcRect/>
                     <a:stretch>
                       <a:fillRect/>
@@ -19446,7 +19644,7 @@
                   <pic:spPr bwMode="auto">
                     <a:xfrm>
                       <a:off x="0" y="0"/>
-                      <a:ext cx="5038725" cy="5876925"/>
+                      <a:ext cx="5038725" cy="6667500"/>
                     </a:xfrm>
                     <a:prstGeom prst="rect">
                       <a:avLst/>
@@ -19473,16 +19671,16 @@
           <w:sz w:val="24"/>
           <w:szCs w:val="24"/>
         </w:rPr>
-        <w:t xml:space="preserve">Gambar 3.6</w:t>
-      </w:r>
-      <w:r>
-        <w:rPr>
-          <w:rFonts w:ascii="Times New Roman" w:eastAsia="Times New Roman" w:hAnsi="Times New Roman"/>
-          <w:color w:val="000000"/>
-          <w:sz w:val="24"/>
-          <w:szCs w:val="24"/>
-        </w:rPr>
-        <w:t xml:space="preserve"> Alur dataset, pelatihan guru–murid, evaluasi, dan deployment</w:t>
+        <w:t xml:space="preserve">Gambar 3.8</w:t>
+      </w:r>
+      <w:r>
+        <w:rPr>
+          <w:rFonts w:ascii="Times New Roman" w:eastAsia="Times New Roman" w:hAnsi="Times New Roman"/>
+          <w:color w:val="000000"/>
+          <w:sz w:val="24"/>
+          <w:szCs w:val="24"/>
+        </w:rPr>
+        <w:t xml:space="preserve"> Alur evaluasi: pembagian data, metrik, uji operasional, uji kegunaan, dan artefak akhir</w:t>
       </w:r>
     </w:p>
     <w:p>
@@ -34597,8 +34795,32 @@
         <w:szCs w:val="20"/>
       </w:rPr>
       <w:fldChar w:fldCharType="begin"/>
+    </w:r>
+    <w:r>
+      <w:rPr>
+        <w:rFonts w:ascii="Times New Roman" w:eastAsia="Times New Roman" w:hAnsi="Times New Roman"/>
+        <w:color w:val="000000"/>
+        <w:sz w:val="20"/>
+        <w:szCs w:val="20"/>
+      </w:rPr>
       <w:instrText xml:space="preserve"> PAGE \* roman \* MERGEFORMAT </w:instrText>
+    </w:r>
+    <w:r>
+      <w:rPr>
+        <w:rFonts w:ascii="Times New Roman" w:eastAsia="Times New Roman" w:hAnsi="Times New Roman"/>
+        <w:color w:val="000000"/>
+        <w:sz w:val="20"/>
+        <w:szCs w:val="20"/>
+      </w:rPr>
       <w:fldChar w:fldCharType="separate"/>
+    </w:r>
+    <w:r>
+      <w:rPr>
+        <w:rFonts w:ascii="Times New Roman" w:eastAsia="Times New Roman" w:hAnsi="Times New Roman"/>
+        <w:color w:val="000000"/>
+        <w:sz w:val="20"/>
+        <w:szCs w:val="20"/>
+      </w:rPr>
       <w:fldChar w:fldCharType="end"/>
     </w:r>
   </w:p>
@@ -34619,8 +34841,32 @@
         <w:szCs w:val="20"/>
       </w:rPr>
       <w:fldChar w:fldCharType="begin"/>
+    </w:r>
+    <w:r>
+      <w:rPr>
+        <w:rFonts w:ascii="Times New Roman" w:eastAsia="Times New Roman" w:hAnsi="Times New Roman"/>
+        <w:color w:val="000000"/>
+        <w:sz w:val="20"/>
+        <w:szCs w:val="20"/>
+      </w:rPr>
       <w:instrText xml:space="preserve"> PAGE \* arabic \* MERGEFORMAT </w:instrText>
+    </w:r>
+    <w:r>
+      <w:rPr>
+        <w:rFonts w:ascii="Times New Roman" w:eastAsia="Times New Roman" w:hAnsi="Times New Roman"/>
+        <w:color w:val="000000"/>
+        <w:sz w:val="20"/>
+        <w:szCs w:val="20"/>
+      </w:rPr>
       <w:fldChar w:fldCharType="separate"/>
+    </w:r>
+    <w:r>
+      <w:rPr>
+        <w:rFonts w:ascii="Times New Roman" w:eastAsia="Times New Roman" w:hAnsi="Times New Roman"/>
+        <w:color w:val="000000"/>
+        <w:sz w:val="20"/>
+        <w:szCs w:val="20"/>
+      </w:rPr>
       <w:fldChar w:fldCharType="end"/>
     </w:r>
   </w:p>
@@ -34913,6 +35159,139 @@
     <w:basedOn w:val="Normal"/>
     <w:qFormat/>
   </w:style>
+  <w:style w:type="paragraph" w:styleId="Caption">
+    <w:name w:val="caption"/>
+    <w:basedOn w:val="Normal"/>
+    <w:next w:val="Normal"/>
+    <w:uiPriority w:val="35"/>
+    <w:semiHidden/>
+    <w:unhideWhenUsed/>
+    <w:qFormat/>
+    <w:pPr>
+      <w:spacing w:after="200"/>
+    </w:pPr>
+    <w:rPr>
+      <w:i/>
+      <w:iCs/>
+      <w:color w:val="44546A" w:themeColor="dark2"/>
+      <w:sz w:val="18"/>
+      <w:szCs w:val="18"/>
+    </w:rPr>
+  </w:style>
+  <w:style w:type="paragraph" w:styleId="Bibliography">
+    <w:name w:val="Bibliography"/>
+    <w:basedOn w:val="Normal"/>
+    <w:next w:val="Normal"/>
+    <w:uiPriority w:val="37"/>
+    <w:unhideWhenUsed/>
+  </w:style>
+  <w:style w:type="paragraph" w:styleId="TOC1">
+    <w:name w:val="toc 1"/>
+    <w:basedOn w:val="Normal"/>
+    <w:next w:val="Normal"/>
+    <w:uiPriority w:val="39"/>
+    <w:semiHidden/>
+    <w:unhideWhenUsed/>
+    <w:pPr>
+      <w:spacing w:after="100"/>
+    </w:pPr>
+  </w:style>
+  <w:style w:type="paragraph" w:styleId="TOC2">
+    <w:name w:val="toc 2"/>
+    <w:basedOn w:val="Normal"/>
+    <w:next w:val="Normal"/>
+    <w:uiPriority w:val="39"/>
+    <w:semiHidden/>
+    <w:unhideWhenUsed/>
+    <w:pPr>
+      <w:spacing w:after="100"/>
+      <w:ind w:left="240"/>
+    </w:pPr>
+  </w:style>
+  <w:style w:type="paragraph" w:styleId="TOC3">
+    <w:name w:val="toc 3"/>
+    <w:basedOn w:val="Normal"/>
+    <w:next w:val="Normal"/>
+    <w:uiPriority w:val="39"/>
+    <w:semiHidden/>
+    <w:unhideWhenUsed/>
+    <w:pPr>
+      <w:spacing w:after="100"/>
+      <w:ind w:left="480"/>
+    </w:pPr>
+  </w:style>
+  <w:style w:type="paragraph" w:styleId="TOC4">
+    <w:name w:val="toc 4"/>
+    <w:basedOn w:val="Normal"/>
+    <w:next w:val="Normal"/>
+    <w:uiPriority w:val="39"/>
+    <w:semiHidden/>
+    <w:unhideWhenUsed/>
+    <w:pPr>
+      <w:spacing w:after="100"/>
+      <w:ind w:left="720"/>
+    </w:pPr>
+  </w:style>
+  <w:style w:type="paragraph" w:styleId="TOC5">
+    <w:name w:val="toc 5"/>
+    <w:basedOn w:val="Normal"/>
+    <w:next w:val="Normal"/>
+    <w:uiPriority w:val="39"/>
+    <w:semiHidden/>
+    <w:unhideWhenUsed/>
+    <w:pPr>
+      <w:spacing w:after="100"/>
+      <w:ind w:left="960"/>
+    </w:pPr>
+  </w:style>
+  <w:style w:type="paragraph" w:styleId="TOC6">
+    <w:name w:val="toc 6"/>
+    <w:basedOn w:val="Normal"/>
+    <w:next w:val="Normal"/>
+    <w:uiPriority w:val="39"/>
+    <w:semiHidden/>
+    <w:unhideWhenUsed/>
+    <w:pPr>
+      <w:spacing w:after="100"/>
+      <w:ind w:left="1200"/>
+    </w:pPr>
+  </w:style>
+  <w:style w:type="paragraph" w:styleId="TOC7">
+    <w:name w:val="toc 7"/>
+    <w:basedOn w:val="Normal"/>
+    <w:next w:val="Normal"/>
+    <w:uiPriority w:val="39"/>
+    <w:semiHidden/>
+    <w:unhideWhenUsed/>
+    <w:pPr>
+      <w:spacing w:after="100"/>
+      <w:ind w:left="1440"/>
+    </w:pPr>
+  </w:style>
+  <w:style w:type="paragraph" w:styleId="TOC8">
+    <w:name w:val="toc 8"/>
+    <w:basedOn w:val="Normal"/>
+    <w:next w:val="Normal"/>
+    <w:uiPriority w:val="39"/>
+    <w:semiHidden/>
+    <w:unhideWhenUsed/>
+    <w:pPr>
+      <w:spacing w:after="100"/>
+      <w:ind w:left="1680"/>
+    </w:pPr>
+  </w:style>
+  <w:style w:type="paragraph" w:styleId="TOC9">
+    <w:name w:val="toc 9"/>
+    <w:basedOn w:val="Normal"/>
+    <w:next w:val="Normal"/>
+    <w:uiPriority w:val="39"/>
+    <w:semiHidden/>
+    <w:unhideWhenUsed/>
+    <w:pPr>
+      <w:spacing w:after="100"/>
+      <w:ind w:left="1920"/>
+    </w:pPr>
+  </w:style>
   <w:style w:type="character" w:styleId="Hyperlink">
     <w:name w:val="Hyperlink"/>
     <w:basedOn w:val="DefaultParagraphFont"/>
@@ -34997,44 +35376,12 @@
       <w:szCs w:val="20"/>
     </w:rPr>
   </w:style>
-  <w:style xmlns:w="http://schemas.openxmlformats.org/wordprocessingml/2006/main" w:type="paragraph" w:styleId="9">
-    <w:name w:val="toc 1"/>
-    <w:basedOn w:val="Normal"/>
-    <w:uiPriority w:val="39"/>
-    <w:pPr>
-      <w:tabs>
-        <w:tab w:val="right" w:leader="dot" w:pos="9026"/>
-      </w:tabs>
-      <w:spacing w:before="120" w:after="60"/>
-    </w:pPr>
-    <w:rPr>
-      <w:b/>
-      <w:bCs/>
-    </w:rPr>
-  </w:style>
-  <w:style xmlns:w="http://schemas.openxmlformats.org/wordprocessingml/2006/main" w:type="paragraph" w:styleId="11">
-    <w:name w:val="toc 2"/>
-    <w:basedOn w:val="Normal"/>
-    <w:uiPriority w:val="39"/>
-    <w:pPr>
-      <w:tabs>
-        <w:tab w:val="right" w:leader="dot" w:pos="9026"/>
-      </w:tabs>
-      <w:ind w:left="360"/>
-      <w:spacing w:before="60" w:after="40"/>
-    </w:pPr>
-  </w:style>
-  <w:style xmlns:w="http://schemas.openxmlformats.org/wordprocessingml/2006/main" w:type="paragraph" w:styleId="12">
-    <w:name w:val="toc 3"/>
-    <w:basedOn w:val="Normal"/>
-    <w:uiPriority w:val="39"/>
-    <w:pPr>
-      <w:tabs>
-        <w:tab w:val="right" w:leader="dot" w:pos="9026"/>
-      </w:tabs>
-      <w:ind w:left="720"/>
-      <w:spacing w:before="40" w:after="20"/>
-    </w:pPr>
+  <w:style w:type="character" w:styleId="LineNumber">
+    <w:name w:val="line number"/>
+    <w:basedOn w:val="DefaultParagraphFont"/>
+    <w:uiPriority w:val="99"/>
+    <w:semiHidden/>
+    <w:unhideWhenUsed/>
   </w:style>
 </w:styles>
 </file>

</xml_diff>